<commit_message>
docs: prepare multi-rig WIP for community testing
</commit_message>
<xml_diff>
--- a/docs/FIO Multi-Rig Isolated Fresh Install Guide.docx
+++ b/docs/FIO Multi-Rig Isolated Fresh Install Guide.docx
@@ -4,24 +4,15 @@
   <w:body>
     <w:p>
       <w:pPr>
-        <w:spacing w:after="60"/>
+        <w:pStyle w:val="Title"/>
       </w:pPr>
       <w:r>
-        <w:rPr>
-          <w:rFonts w:ascii="Calibri" w:hAnsi="Calibri"/>
-          <w:b/>
-          <w:color w:val="0B2545"/>
-          <w:sz w:val="44"/>
-        </w:rPr>
         <w:t>FIO Multi-Rig Isolated Fresh Install Guide</w:t>
       </w:r>
     </w:p>
     <w:p>
-      <w:pPr>
-        <w:pStyle w:val="SmallNote"/>
-      </w:pPr>
       <w:r>
-        <w:t>Fresh Linux install procedure using a dedicated multi-rig config/runtime location.</w:t>
+        <w:t>Use this Linux procedure for ordinary testing-community installs. It keeps the 2.0 WIP checkout and profile separate from a normal single-rig installation. Do not use the production ~/.freqinout root.</w:t>
       </w:r>
     </w:p>
     <w:p>
@@ -29,12 +20,349 @@
         <w:pStyle w:val="Heading1"/>
       </w:pPr>
       <w:r>
-        <w:t>Purpose</w:t>
+        <w:t>Target paths</w:t>
+      </w:r>
+    </w:p>
+    <w:tbl>
+      <w:tblPr>
+        <w:tblStyle w:val="TableGrid"/>
+        <w:tblW w:type="auto" w:w="0"/>
+        <w:tblLayout w:type="autofit"/>
+        <w:tblLook w:firstColumn="1" w:firstRow="1" w:lastColumn="0" w:lastRow="0" w:noHBand="0" w:noVBand="1" w:val="04A0"/>
+      </w:tblPr>
+      <w:tblGrid>
+        <w:gridCol w:w="5141"/>
+        <w:gridCol w:w="5141"/>
+      </w:tblGrid>
+      <w:tr>
+        <w:trPr>
+          <w:cantSplit/>
+          <w:tblHeader w:val="true"/>
+        </w:trPr>
+        <w:tc>
+          <w:tcPr>
+            <w:tcW w:type="dxa" w:w="5141"/>
+            <w:tcMar>
+              <w:top w:w="70" w:type="dxa"/>
+              <w:start w:w="90" w:type="dxa"/>
+              <w:bottom w:w="70" w:type="dxa"/>
+              <w:end w:w="90" w:type="dxa"/>
+            </w:tcMar>
+            <w:vAlign w:val="center"/>
+            <w:shd w:fill="E8EDF3"/>
+          </w:tcPr>
+          <w:p>
+            <w:pPr>
+              <w:spacing w:after="0"/>
+            </w:pPr>
+            <w:r>
+              <w:rPr>
+                <w:rFonts w:ascii="Aptos" w:hAnsi="Aptos"/>
+                <w:b/>
+                <w:sz w:val="16"/>
+              </w:rPr>
+              <w:t>Item</w:t>
+            </w:r>
+          </w:p>
+        </w:tc>
+        <w:tc>
+          <w:tcPr>
+            <w:tcW w:type="dxa" w:w="5141"/>
+            <w:tcMar>
+              <w:top w:w="70" w:type="dxa"/>
+              <w:start w:w="90" w:type="dxa"/>
+              <w:bottom w:w="70" w:type="dxa"/>
+              <w:end w:w="90" w:type="dxa"/>
+            </w:tcMar>
+            <w:vAlign w:val="center"/>
+            <w:shd w:fill="E8EDF3"/>
+          </w:tcPr>
+          <w:p>
+            <w:pPr>
+              <w:spacing w:after="0"/>
+            </w:pPr>
+            <w:r>
+              <w:rPr>
+                <w:rFonts w:ascii="Aptos" w:hAnsi="Aptos"/>
+                <w:b/>
+                <w:sz w:val="16"/>
+              </w:rPr>
+              <w:t>Test path</w:t>
+            </w:r>
+          </w:p>
+        </w:tc>
+      </w:tr>
+      <w:tr>
+        <w:trPr>
+          <w:cantSplit/>
+        </w:trPr>
+        <w:tc>
+          <w:tcPr>
+            <w:tcW w:type="dxa" w:w="5141"/>
+            <w:tcMar>
+              <w:top w:w="70" w:type="dxa"/>
+              <w:start w:w="90" w:type="dxa"/>
+              <w:bottom w:w="70" w:type="dxa"/>
+              <w:end w:w="90" w:type="dxa"/>
+            </w:tcMar>
+            <w:vAlign w:val="center"/>
+          </w:tcPr>
+          <w:p>
+            <w:pPr>
+              <w:spacing w:after="0"/>
+            </w:pPr>
+            <w:r>
+              <w:rPr>
+                <w:rFonts w:ascii="Aptos" w:hAnsi="Aptos"/>
+                <w:b w:val="0"/>
+                <w:sz w:val="16"/>
+              </w:rPr>
+              <w:t>Application</w:t>
+            </w:r>
+          </w:p>
+        </w:tc>
+        <w:tc>
+          <w:tcPr>
+            <w:tcW w:type="dxa" w:w="5141"/>
+            <w:tcMar>
+              <w:top w:w="70" w:type="dxa"/>
+              <w:start w:w="90" w:type="dxa"/>
+              <w:bottom w:w="70" w:type="dxa"/>
+              <w:end w:w="90" w:type="dxa"/>
+            </w:tcMar>
+            <w:vAlign w:val="center"/>
+          </w:tcPr>
+          <w:p>
+            <w:pPr>
+              <w:spacing w:after="0"/>
+            </w:pPr>
+            <w:r>
+              <w:rPr>
+                <w:rFonts w:ascii="Aptos" w:hAnsi="Aptos"/>
+                <w:b w:val="0"/>
+                <w:sz w:val="16"/>
+              </w:rPr>
+              <w:t>$HOME/FreqInOut-multi-rig-test</w:t>
+            </w:r>
+          </w:p>
+        </w:tc>
+      </w:tr>
+      <w:tr>
+        <w:trPr>
+          <w:cantSplit/>
+        </w:trPr>
+        <w:tc>
+          <w:tcPr>
+            <w:tcW w:type="dxa" w:w="5141"/>
+            <w:tcMar>
+              <w:top w:w="70" w:type="dxa"/>
+              <w:start w:w="90" w:type="dxa"/>
+              <w:bottom w:w="70" w:type="dxa"/>
+              <w:end w:w="90" w:type="dxa"/>
+            </w:tcMar>
+            <w:vAlign w:val="center"/>
+          </w:tcPr>
+          <w:p>
+            <w:pPr>
+              <w:spacing w:after="0"/>
+            </w:pPr>
+            <w:r>
+              <w:rPr>
+                <w:rFonts w:ascii="Aptos" w:hAnsi="Aptos"/>
+                <w:b w:val="0"/>
+                <w:sz w:val="16"/>
+              </w:rPr>
+              <w:t>Profile root</w:t>
+            </w:r>
+          </w:p>
+        </w:tc>
+        <w:tc>
+          <w:tcPr>
+            <w:tcW w:type="dxa" w:w="5141"/>
+            <w:tcMar>
+              <w:top w:w="70" w:type="dxa"/>
+              <w:start w:w="90" w:type="dxa"/>
+              <w:bottom w:w="70" w:type="dxa"/>
+              <w:end w:w="90" w:type="dxa"/>
+            </w:tcMar>
+            <w:vAlign w:val="center"/>
+          </w:tcPr>
+          <w:p>
+            <w:pPr>
+              <w:spacing w:after="0"/>
+            </w:pPr>
+            <w:r>
+              <w:rPr>
+                <w:rFonts w:ascii="Aptos" w:hAnsi="Aptos"/>
+                <w:b w:val="0"/>
+                <w:sz w:val="16"/>
+              </w:rPr>
+              <w:t>$HOME/.freqinout-multi-rig-test</w:t>
+            </w:r>
+          </w:p>
+        </w:tc>
+      </w:tr>
+      <w:tr>
+        <w:trPr>
+          <w:cantSplit/>
+        </w:trPr>
+        <w:tc>
+          <w:tcPr>
+            <w:tcW w:type="dxa" w:w="5141"/>
+            <w:tcMar>
+              <w:top w:w="70" w:type="dxa"/>
+              <w:start w:w="90" w:type="dxa"/>
+              <w:bottom w:w="70" w:type="dxa"/>
+              <w:end w:w="90" w:type="dxa"/>
+            </w:tcMar>
+            <w:vAlign w:val="center"/>
+          </w:tcPr>
+          <w:p>
+            <w:pPr>
+              <w:spacing w:after="0"/>
+            </w:pPr>
+            <w:r>
+              <w:rPr>
+                <w:rFonts w:ascii="Aptos" w:hAnsi="Aptos"/>
+                <w:b w:val="0"/>
+                <w:sz w:val="16"/>
+              </w:rPr>
+              <w:t>Settings DB</w:t>
+            </w:r>
+          </w:p>
+        </w:tc>
+        <w:tc>
+          <w:tcPr>
+            <w:tcW w:type="dxa" w:w="5141"/>
+            <w:tcMar>
+              <w:top w:w="70" w:type="dxa"/>
+              <w:start w:w="90" w:type="dxa"/>
+              <w:bottom w:w="70" w:type="dxa"/>
+              <w:end w:w="90" w:type="dxa"/>
+            </w:tcMar>
+            <w:vAlign w:val="center"/>
+          </w:tcPr>
+          <w:p>
+            <w:pPr>
+              <w:spacing w:after="0"/>
+            </w:pPr>
+            <w:r>
+              <w:rPr>
+                <w:rFonts w:ascii="Aptos" w:hAnsi="Aptos"/>
+                <w:b w:val="0"/>
+                <w:sz w:val="16"/>
+              </w:rPr>
+              <w:t>$HOME/.freqinout-multi-rig-test/config/freqinout.db</w:t>
+            </w:r>
+          </w:p>
+        </w:tc>
+      </w:tr>
+      <w:tr>
+        <w:trPr>
+          <w:cantSplit/>
+        </w:trPr>
+        <w:tc>
+          <w:tcPr>
+            <w:tcW w:type="dxa" w:w="5141"/>
+            <w:tcMar>
+              <w:top w:w="70" w:type="dxa"/>
+              <w:start w:w="90" w:type="dxa"/>
+              <w:bottom w:w="70" w:type="dxa"/>
+              <w:end w:w="90" w:type="dxa"/>
+            </w:tcMar>
+            <w:vAlign w:val="center"/>
+          </w:tcPr>
+          <w:p>
+            <w:pPr>
+              <w:spacing w:after="0"/>
+            </w:pPr>
+            <w:r>
+              <w:rPr>
+                <w:rFonts w:ascii="Aptos" w:hAnsi="Aptos"/>
+                <w:b w:val="0"/>
+                <w:sz w:val="16"/>
+              </w:rPr>
+              <w:t>Operational DB</w:t>
+            </w:r>
+          </w:p>
+        </w:tc>
+        <w:tc>
+          <w:tcPr>
+            <w:tcW w:type="dxa" w:w="5141"/>
+            <w:tcMar>
+              <w:top w:w="70" w:type="dxa"/>
+              <w:start w:w="90" w:type="dxa"/>
+              <w:bottom w:w="70" w:type="dxa"/>
+              <w:end w:w="90" w:type="dxa"/>
+            </w:tcMar>
+            <w:vAlign w:val="center"/>
+          </w:tcPr>
+          <w:p>
+            <w:pPr>
+              <w:spacing w:after="0"/>
+            </w:pPr>
+            <w:r>
+              <w:rPr>
+                <w:rFonts w:ascii="Aptos" w:hAnsi="Aptos"/>
+                <w:b w:val="0"/>
+                <w:sz w:val="16"/>
+              </w:rPr>
+              <w:t>$HOME/.freqinout-multi-rig-test/config/freqinout_nets.db</w:t>
+            </w:r>
+          </w:p>
+        </w:tc>
+      </w:tr>
+    </w:tbl>
+    <w:p>
+      <w:pPr>
+        <w:spacing w:after="20"/>
+      </w:pPr>
+    </w:p>
+    <w:p>
+      <w:pPr>
+        <w:pStyle w:val="Heading1"/>
+      </w:pPr>
+      <w:r>
+        <w:t>Install</w:t>
       </w:r>
     </w:p>
     <w:p>
       <w:r>
-        <w:t>Use this guide to install the current multi-rig WIP on Linux without touching the normal single-rig configuration. Run this fresh isolated pass before any in-place upgrade test.</w:t>
+        <w:t>The private repository requires testing-community access.</w:t>
+      </w:r>
+    </w:p>
+    <w:p>
+      <w:pPr>
+        <w:keepLines/>
+        <w:spacing w:before="40" w:after="120"/>
+        <w:shd w:fill="F2F4F7"/>
+      </w:pPr>
+      <w:r>
+        <w:rPr>
+          <w:rFonts w:ascii="Consolas" w:hAnsi="Consolas"/>
+          <w:color w:val="191C20"/>
+          <w:sz w:val="15"/>
+        </w:rPr>
+        <w:t>git clone --branch "wip/private-testing-multi-rig-1.2.3-not-ready" \</w:t>
+        <w:br/>
+        <w:t xml:space="preserve">  https://github.com/N1MAG/FreqInOut-internal-testing.git \</w:t>
+        <w:br/>
+        <w:t xml:space="preserve">  "$HOME/FreqInOut-multi-rig-test"</w:t>
+        <w:br/>
+        <w:t>cd "$HOME/FreqInOut-multi-rig-test"</w:t>
+        <w:br/>
+        <w:t>bash install_FreqInOut_linux.sh \</w:t>
+        <w:br/>
+        <w:t xml:space="preserve">  --dir "$HOME/FreqInOut-multi-rig-test" \</w:t>
+        <w:br/>
+        <w:t xml:space="preserve">  --config-root "$HOME/.freqinout-multi-rig-test" \</w:t>
+        <w:br/>
+        <w:t xml:space="preserve">  --branch "wip/private-testing-multi-rig-1.2.3-not-ready"</w:t>
+      </w:r>
+    </w:p>
+    <w:p>
+      <w:r>
+        <w:t>--config-root is part of the safety contract: it applies to installer migration work and is written into the generated freqinout launcher. Keep this argument unchanged for every update or repair.</w:t>
       </w:r>
     </w:p>
     <w:p>
@@ -42,394 +370,26 @@
         <w:pStyle w:val="Heading1"/>
       </w:pPr>
       <w:r>
-        <w:t>Target Paths</w:t>
+        <w:t>Launch and verify isolation</w:t>
       </w:r>
     </w:p>
-    <w:tbl>
-      <w:tblPr>
-        <w:tblStyle w:val="TableGrid"/>
-        <w:tblW w:type="dxa" w:w="9360"/>
-        <w:jc w:val="left"/>
-        <w:tblLook w:firstColumn="1" w:firstRow="1" w:lastColumn="0" w:lastRow="0" w:noHBand="0" w:noVBand="1" w:val="04A0"/>
-        <w:tblInd w:w="120" w:type="dxa"/>
-      </w:tblPr>
-      <w:tblGrid>
-        <w:gridCol w:w="4680"/>
-        <w:gridCol w:w="4680"/>
-      </w:tblGrid>
-      <w:tr>
-        <w:tc>
-          <w:tcPr>
-            <w:tcW w:type="dxa" w:w="2700"/>
-            <w:shd w:fill="E8EEF5"/>
-          </w:tcPr>
-          <w:p>
-            <w:r>
-              <w:rPr>
-                <w:b/>
-              </w:rPr>
-              <w:t>Item</w:t>
-            </w:r>
-          </w:p>
-        </w:tc>
-        <w:tc>
-          <w:tcPr>
-            <w:tcW w:type="dxa" w:w="6660"/>
-            <w:shd w:fill="E8EEF5"/>
-          </w:tcPr>
-          <w:p>
-            <w:r>
-              <w:rPr>
-                <w:b/>
-              </w:rPr>
-              <w:t>Path / Value</w:t>
-            </w:r>
-          </w:p>
-        </w:tc>
-      </w:tr>
-      <w:tr>
-        <w:tc>
-          <w:tcPr>
-            <w:tcW w:type="dxa" w:w="2700"/>
-            <w:vAlign w:val="center"/>
-          </w:tcPr>
-          <w:p>
-            <w:pPr>
-              <w:spacing w:after="0"/>
-            </w:pPr>
-            <w:r>
-              <w:t>App install folder</w:t>
-            </w:r>
-          </w:p>
-        </w:tc>
-        <w:tc>
-          <w:tcPr>
-            <w:tcW w:type="dxa" w:w="6660"/>
-            <w:vAlign w:val="center"/>
-          </w:tcPr>
-          <w:p>
-            <w:pPr>
-              <w:spacing w:after="0"/>
-            </w:pPr>
-            <w:r>
-              <w:t>$HOME/FreqInOut-multi-rig-test</w:t>
-            </w:r>
-          </w:p>
-        </w:tc>
-      </w:tr>
-      <w:tr>
-        <w:tc>
-          <w:tcPr>
-            <w:tcW w:type="dxa" w:w="2700"/>
-            <w:vAlign w:val="center"/>
-          </w:tcPr>
-          <w:p>
-            <w:pPr>
-              <w:spacing w:after="0"/>
-            </w:pPr>
-            <w:r>
-              <w:t>Dedicated config/runtime root</w:t>
-            </w:r>
-          </w:p>
-        </w:tc>
-        <w:tc>
-          <w:tcPr>
-            <w:tcW w:type="dxa" w:w="6660"/>
-            <w:vAlign w:val="center"/>
-          </w:tcPr>
-          <w:p>
-            <w:pPr>
-              <w:spacing w:after="0"/>
-            </w:pPr>
-            <w:r>
-              <w:t>$HOME/.freqinout-multi-rig-test</w:t>
-            </w:r>
-          </w:p>
-        </w:tc>
-      </w:tr>
-      <w:tr>
-        <w:tc>
-          <w:tcPr>
-            <w:tcW w:type="dxa" w:w="2700"/>
-            <w:vAlign w:val="center"/>
-          </w:tcPr>
-          <w:p>
-            <w:pPr>
-              <w:spacing w:after="0"/>
-            </w:pPr>
-            <w:r>
-              <w:t>Settings database</w:t>
-            </w:r>
-          </w:p>
-        </w:tc>
-        <w:tc>
-          <w:tcPr>
-            <w:tcW w:type="dxa" w:w="6660"/>
-            <w:vAlign w:val="center"/>
-          </w:tcPr>
-          <w:p>
-            <w:pPr>
-              <w:spacing w:after="0"/>
-            </w:pPr>
-            <w:r>
-              <w:t>$HOME/.freqinout-multi-rig-test/config/freqinout.db</w:t>
-            </w:r>
-          </w:p>
-        </w:tc>
-      </w:tr>
-      <w:tr>
-        <w:tc>
-          <w:tcPr>
-            <w:tcW w:type="dxa" w:w="2700"/>
-            <w:vAlign w:val="center"/>
-          </w:tcPr>
-          <w:p>
-            <w:pPr>
-              <w:spacing w:after="0"/>
-            </w:pPr>
-            <w:r>
-              <w:t>Nets/runtime database</w:t>
-            </w:r>
-          </w:p>
-        </w:tc>
-        <w:tc>
-          <w:tcPr>
-            <w:tcW w:type="dxa" w:w="6660"/>
-            <w:vAlign w:val="center"/>
-          </w:tcPr>
-          <w:p>
-            <w:pPr>
-              <w:spacing w:after="0"/>
-            </w:pPr>
-            <w:r>
-              <w:t>$HOME/.freqinout-multi-rig-test/config/freqinout_nets.db</w:t>
-            </w:r>
-          </w:p>
-        </w:tc>
-      </w:tr>
-      <w:tr>
-        <w:tc>
-          <w:tcPr>
-            <w:tcW w:type="dxa" w:w="2700"/>
-            <w:vAlign w:val="center"/>
-          </w:tcPr>
-          <w:p>
-            <w:pPr>
-              <w:spacing w:after="0"/>
-            </w:pPr>
-            <w:r>
-              <w:t>Optional launcher command</w:t>
-            </w:r>
-          </w:p>
-        </w:tc>
-        <w:tc>
-          <w:tcPr>
-            <w:tcW w:type="dxa" w:w="6660"/>
-            <w:vAlign w:val="center"/>
-          </w:tcPr>
-          <w:p>
-            <w:pPr>
-              <w:spacing w:after="0"/>
-            </w:pPr>
-            <w:r>
-              <w:t>$HOME/.local/bin/freqinout-multi-rig-test</w:t>
-            </w:r>
-          </w:p>
-        </w:tc>
-      </w:tr>
-    </w:tbl>
     <w:p>
-      <w:pPr>
-        <w:pStyle w:val="SmallNote"/>
-      </w:pPr>
-    </w:p>
-    <w:p>
-      <w:pPr>
-        <w:pStyle w:val="Heading1"/>
-      </w:pPr>
       <w:r>
-        <w:t>Fresh Install Steps</w:t>
+        <w:t>Run freqinout from a terminal or use the desktop/menu entry. Then verify:</w:t>
       </w:r>
     </w:p>
     <w:p>
       <w:pPr>
-        <w:pStyle w:val="ListNumber"/>
-        <w:spacing w:after="80" w:line="300" w:lineRule="auto"/>
-        <w:ind w:left="540" w:hanging="271"/>
+        <w:keepLines/>
+        <w:spacing w:before="40" w:after="120"/>
+        <w:shd w:fill="F2F4F7"/>
       </w:pPr>
       <w:r>
-        <w:t>Open a terminal on the Linux test machine.</w:t>
-      </w:r>
-    </w:p>
-    <w:p>
-      <w:pPr>
-        <w:pStyle w:val="ListNumber"/>
-        <w:spacing w:after="80" w:line="300" w:lineRule="auto"/>
-        <w:ind w:left="540" w:hanging="271"/>
-      </w:pPr>
-      <w:r>
-        <w:t>Clone the multi-rig WIP repo into a dedicated app folder.</w:t>
-      </w:r>
-    </w:p>
-    <w:p>
-      <w:pPr>
-        <w:pStyle w:val="CommandBlock"/>
-        <w:shd w:fill="F4F6F9"/>
-      </w:pPr>
-      <w:r>
-        <w:t>git clone --branch "wip/private-testing-multi-rig-1.2.3-not-ready" \</w:t>
-      </w:r>
-    </w:p>
-    <w:p>
-      <w:pPr>
-        <w:pStyle w:val="CommandBlock"/>
-        <w:shd w:fill="F4F6F9"/>
-      </w:pPr>
-      <w:r>
-        <w:t xml:space="preserve">  git@github.com:N1MAG/FreqInOut-internal-testing.git \</w:t>
-      </w:r>
-    </w:p>
-    <w:p>
-      <w:pPr>
-        <w:pStyle w:val="CommandBlock"/>
-        <w:shd w:fill="F4F6F9"/>
-      </w:pPr>
-      <w:r>
-        <w:t xml:space="preserve">  "$HOME/FreqInOut-multi-rig-test"</w:t>
-      </w:r>
-    </w:p>
-    <w:p>
-      <w:pPr>
-        <w:pStyle w:val="CommandBlock"/>
-        <w:shd w:fill="F4F6F9"/>
-      </w:pPr>
-    </w:p>
-    <w:p>
-      <w:pPr>
-        <w:pStyle w:val="CommandBlock"/>
-        <w:shd w:fill="F4F6F9"/>
-      </w:pPr>
-      <w:r>
-        <w:t>cd "$HOME/FreqInOut-multi-rig-test"</w:t>
-      </w:r>
-    </w:p>
-    <w:p>
-      <w:pPr>
-        <w:pStyle w:val="ListNumber"/>
-        <w:spacing w:after="80" w:line="300" w:lineRule="auto"/>
-        <w:ind w:left="540" w:hanging="271"/>
-      </w:pPr>
-      <w:r>
-        <w:t>Create the dedicated config root.</w:t>
-      </w:r>
-    </w:p>
-    <w:p>
-      <w:pPr>
-        <w:pStyle w:val="CommandBlock"/>
-        <w:shd w:fill="F4F6F9"/>
-      </w:pPr>
-      <w:r>
-        <w:t>mkdir -p "$HOME/.freqinout-multi-rig-test"</w:t>
-      </w:r>
-    </w:p>
-    <w:p>
-      <w:pPr>
-        <w:pStyle w:val="ListNumber"/>
-        <w:spacing w:after="80" w:line="300" w:lineRule="auto"/>
-        <w:ind w:left="540" w:hanging="271"/>
-      </w:pPr>
-      <w:r>
-        <w:t>Run the Linux installer from the checked-out repo.</w:t>
-      </w:r>
-    </w:p>
-    <w:p>
-      <w:pPr>
-        <w:pStyle w:val="CommandBlock"/>
-        <w:shd w:fill="F4F6F9"/>
-      </w:pPr>
-      <w:r>
-        <w:t>bash install_FreqInOut_linux.sh \</w:t>
-      </w:r>
-    </w:p>
-    <w:p>
-      <w:pPr>
-        <w:pStyle w:val="CommandBlock"/>
-        <w:shd w:fill="F4F6F9"/>
-      </w:pPr>
-      <w:r>
-        <w:t xml:space="preserve">  --dir "$HOME/FreqInOut-multi-rig-test"</w:t>
-      </w:r>
-    </w:p>
-    <w:p>
-      <w:r>
-        <w:t>The installer in this WIP branch defaults to the internal testing repository and branch:</w:t>
-      </w:r>
-    </w:p>
-    <w:p>
-      <w:pPr>
-        <w:pStyle w:val="CommandBlock"/>
-        <w:shd w:fill="F4F6F9"/>
-      </w:pPr>
-      <w:r>
-        <w:t>Repository: git@github.com:N1MAG/FreqInOut-internal-testing.git</w:t>
-      </w:r>
-    </w:p>
-    <w:p>
-      <w:pPr>
-        <w:pStyle w:val="CommandBlock"/>
-        <w:shd w:fill="F4F6F9"/>
-      </w:pPr>
-      <w:r>
-        <w:t>Branch: wip/private-testing-multi-rig-1.2.3-not-ready</w:t>
-      </w:r>
-    </w:p>
-    <w:p>
-      <w:pPr>
-        <w:pStyle w:val="ListNumber"/>
-        <w:spacing w:after="80" w:line="300" w:lineRule="auto"/>
-        <w:ind w:left="540" w:hanging="271"/>
-      </w:pPr>
-      <w:r>
-        <w:t>Start FIO with the isolated config location.</w:t>
-      </w:r>
-    </w:p>
-    <w:p>
-      <w:pPr>
-        <w:pStyle w:val="CommandBlock"/>
-        <w:shd w:fill="F4F6F9"/>
-      </w:pPr>
-      <w:r>
-        <w:t>FREQINOUT_CONFIG_DIR="$HOME/.freqinout-multi-rig-test" \</w:t>
-      </w:r>
-    </w:p>
-    <w:p>
-      <w:pPr>
-        <w:pStyle w:val="CommandBlock"/>
-        <w:shd w:fill="F4F6F9"/>
-      </w:pPr>
-      <w:r>
-        <w:t>"$HOME/FreqInOut-multi-rig-test/venv/bin/python" -m freqinout.main</w:t>
-      </w:r>
-    </w:p>
-    <w:p>
-      <w:r>
-        <w:t>On first launch, FIO should create a fresh multi-rig blank slate. It should not read or migrate the regular single-rig config.</w:t>
-      </w:r>
-    </w:p>
-    <w:p>
-      <w:pPr>
-        <w:pStyle w:val="Heading1"/>
-      </w:pPr>
-      <w:r>
-        <w:t>Confirm the Database Location</w:t>
-      </w:r>
-    </w:p>
-    <w:p>
-      <w:pPr>
-        <w:pStyle w:val="CommandBlock"/>
-        <w:shd w:fill="F4F6F9"/>
-      </w:pPr>
-      <w:r>
+        <w:rPr>
+          <w:rFonts w:ascii="Consolas" w:hAnsi="Consolas"/>
+          <w:color w:val="191C20"/>
+          <w:sz w:val="15"/>
+        </w:rPr>
         <w:t>ls -la "$HOME/.freqinout-multi-rig-test/config"</w:t>
       </w:r>
     </w:p>
@@ -440,25 +400,68 @@
     </w:p>
     <w:p>
       <w:pPr>
-        <w:pStyle w:val="CommandBlock"/>
-        <w:shd w:fill="F4F6F9"/>
+        <w:keepLines/>
+        <w:spacing w:before="40" w:after="120"/>
+        <w:shd w:fill="F2F4F7"/>
       </w:pPr>
       <w:r>
+        <w:rPr>
+          <w:rFonts w:ascii="Consolas" w:hAnsi="Consolas"/>
+          <w:color w:val="191C20"/>
+          <w:sz w:val="15"/>
+        </w:rPr>
         <w:t>freqinout.db</w:t>
       </w:r>
     </w:p>
     <w:p>
       <w:r>
-        <w:t>After app use, this may also appear:</w:t>
+        <w:t>freqinout_nets.db appears after operational features initialize. The test must not create, modify, or migrate $HOME/.freqinout/config/freqinout.db.</w:t>
+      </w:r>
+    </w:p>
+    <w:p>
+      <w:r>
+        <w:t>For a direct launch that does not use the generated launcher:</w:t>
       </w:r>
     </w:p>
     <w:p>
       <w:pPr>
-        <w:pStyle w:val="CommandBlock"/>
-        <w:shd w:fill="F4F6F9"/>
+        <w:keepLines/>
+        <w:spacing w:before="40" w:after="120"/>
+        <w:shd w:fill="F2F4F7"/>
       </w:pPr>
       <w:r>
-        <w:t>freqinout_nets.db</w:t>
+        <w:rPr>
+          <w:rFonts w:ascii="Consolas" w:hAnsi="Consolas"/>
+          <w:color w:val="191C20"/>
+          <w:sz w:val="15"/>
+        </w:rPr>
+        <w:t>FREQINOUT_CONFIG_DIR="$HOME/.freqinout-multi-rig-test" \</w:t>
+        <w:br/>
+        <w:t xml:space="preserve">  "$HOME/FreqInOut-multi-rig-test/venv/bin/python" -m freqinout.main</w:t>
+      </w:r>
+    </w:p>
+    <w:p>
+      <w:r>
+        <w:t>The repository helper can also launch a source install and accepts both locations without editing the script:</w:t>
+      </w:r>
+    </w:p>
+    <w:p>
+      <w:pPr>
+        <w:keepLines/>
+        <w:spacing w:before="40" w:after="120"/>
+        <w:shd w:fill="F2F4F7"/>
+      </w:pPr>
+      <w:r>
+        <w:rPr>
+          <w:rFonts w:ascii="Consolas" w:hAnsi="Consolas"/>
+          <w:color w:val="191C20"/>
+          <w:sz w:val="15"/>
+        </w:rPr>
+        <w:t>FREQINOUT_INSTALL_DIR="$HOME/FreqInOut-multi-rig-test" \</w:t>
+        <w:br/>
+        <w:t>FREQINOUT_RUNTIME_ROOT="$HOME/.freqinout-multi-rig-test" \</w:t>
+        <w:br/>
+        <w:t xml:space="preserve">  "$HOME/FreqInOut-multi-rig-test/start-multi-rig.sh"</w:t>
       </w:r>
     </w:p>
     <w:p>
@@ -466,110 +469,65 @@
         <w:pStyle w:val="Heading1"/>
       </w:pPr>
       <w:r>
-        <w:t>Optional Dedicated Launcher</w:t>
-      </w:r>
-    </w:p>
-    <w:p>
-      <w:r>
-        <w:t>Create a separate command for repeated test launches:</w:t>
+        <w:t>Acceptance checks</w:t>
       </w:r>
     </w:p>
     <w:p>
       <w:pPr>
-        <w:pStyle w:val="CommandBlock"/>
-        <w:shd w:fill="F4F6F9"/>
+        <w:pStyle w:val="ListBullet"/>
+        <w:spacing w:after="30"/>
       </w:pPr>
       <w:r>
-        <w:t>mkdir -p "$HOME/.local/bin"</w:t>
+        <w:t>The test databases exist only beneath the dedicated profile root for this run.</w:t>
       </w:r>
     </w:p>
     <w:p>
       <w:pPr>
-        <w:pStyle w:val="CommandBlock"/>
-        <w:shd w:fill="F4F6F9"/>
-      </w:pPr>
-    </w:p>
-    <w:p>
-      <w:pPr>
-        <w:pStyle w:val="CommandBlock"/>
-        <w:shd w:fill="F4F6F9"/>
+        <w:pStyle w:val="ListBullet"/>
+        <w:spacing w:after="30"/>
       </w:pPr>
       <w:r>
-        <w:t>cat &gt; "$HOME/.local/bin/freqinout-multi-rig-test" &lt;&lt;'EOF'</w:t>
+        <w:rPr>
+          <w:rFonts w:ascii="Aptos" w:hAnsi="Aptos"/>
+          <w:sz w:val="18"/>
+        </w:rPr>
+        <w:t>Settings begins as a fresh profile without production radio data; the first radio and Station Default assignment are created intentionally.</w:t>
       </w:r>
     </w:p>
     <w:p>
       <w:pPr>
-        <w:pStyle w:val="CommandBlock"/>
-        <w:shd w:fill="F4F6F9"/>
+        <w:pStyle w:val="ListBullet"/>
+        <w:spacing w:after="30"/>
       </w:pPr>
       <w:r>
-        <w:t>#!/usr/bin/env bash</w:t>
+        <w:t>Settings, theme, radio profiles, and window placement persist after restart.</w:t>
       </w:r>
     </w:p>
     <w:p>
       <w:pPr>
-        <w:pStyle w:val="CommandBlock"/>
-        <w:shd w:fill="F4F6F9"/>
+        <w:pStyle w:val="ListBullet"/>
+        <w:spacing w:after="30"/>
       </w:pPr>
       <w:r>
-        <w:t>export FREQINOUT_CONFIG_DIR="$HOME/.freqinout-multi-rig-test"</w:t>
+        <w:t>Message Inbox, FIO Spotter, Compose, and the separate Map window open without blocking the main window.</w:t>
       </w:r>
     </w:p>
     <w:p>
       <w:pPr>
-        <w:pStyle w:val="CommandBlock"/>
-        <w:shd w:fill="F4F6F9"/>
+        <w:pStyle w:val="ListBullet"/>
+        <w:spacing w:after="30"/>
       </w:pPr>
       <w:r>
-        <w:t>cd "$HOME/FreqInOut-multi-rig-test"</w:t>
+        <w:t>The Map remains usable offline and never requests an API key or tile download.</w:t>
       </w:r>
     </w:p>
     <w:p>
       <w:pPr>
-        <w:pStyle w:val="CommandBlock"/>
-        <w:shd w:fill="F4F6F9"/>
+        <w:pStyle w:val="ListBullet"/>
+        <w:spacing w:after="30"/>
       </w:pPr>
       <w:r>
-        <w:t>exec "$HOME/FreqInOut-multi-rig-test/venv/bin/python" -m freqinout.main "$@"</w:t>
-      </w:r>
-    </w:p>
-    <w:p>
-      <w:pPr>
-        <w:pStyle w:val="CommandBlock"/>
-        <w:shd w:fill="F4F6F9"/>
-      </w:pPr>
-      <w:r>
-        <w:t>EOF</w:t>
-      </w:r>
-    </w:p>
-    <w:p>
-      <w:pPr>
-        <w:pStyle w:val="CommandBlock"/>
-        <w:shd w:fill="F4F6F9"/>
-      </w:pPr>
-    </w:p>
-    <w:p>
-      <w:pPr>
-        <w:pStyle w:val="CommandBlock"/>
-        <w:shd w:fill="F4F6F9"/>
-      </w:pPr>
-      <w:r>
-        <w:t>chmod +x "$HOME/.local/bin/freqinout-multi-rig-test"</w:t>
-      </w:r>
-    </w:p>
-    <w:p>
-      <w:r>
-        <w:t>Run it with:</w:t>
-      </w:r>
-    </w:p>
-    <w:p>
-      <w:pPr>
-        <w:pStyle w:val="CommandBlock"/>
-        <w:shd w:fill="F4F6F9"/>
-      </w:pPr>
-      <w:r>
-        <w:t>freqinout-multi-rig-test</w:t>
+        <w:t>Station Health distinguishes actionable configuration problems from normal waiting states.</w:t>
       </w:r>
     </w:p>
     <w:p>
@@ -577,326 +535,22 @@
         <w:pStyle w:val="Heading1"/>
       </w:pPr>
       <w:r>
-        <w:t>Update start-multi-rig.sh</w:t>
+        <w:t>Update or repair</w:t>
       </w:r>
     </w:p>
     <w:p>
       <w:r>
-        <w:t>To make /Users/bill/RadioCode/FreqInOut-multi-rig/start-multi-rig.sh launch this custom install, replace the path block near the top with:</w:t>
-      </w:r>
-    </w:p>
-    <w:p>
-      <w:pPr>
-        <w:pStyle w:val="CommandBlock"/>
-        <w:shd w:fill="F4F6F9"/>
-      </w:pPr>
-      <w:r>
-        <w:t>WORKTREE="${FREQINOUT_INSTALL_DIR:-$HOME/FreqInOut-multi-rig-test}"</w:t>
-      </w:r>
-    </w:p>
-    <w:p>
-      <w:pPr>
-        <w:pStyle w:val="CommandBlock"/>
-        <w:shd w:fill="F4F6F9"/>
-      </w:pPr>
-      <w:r>
-        <w:t>VENV="$WORKTREE/venv"</w:t>
-      </w:r>
-    </w:p>
-    <w:p>
-      <w:pPr>
-        <w:pStyle w:val="CommandBlock"/>
-        <w:shd w:fill="F4F6F9"/>
-      </w:pPr>
-      <w:r>
-        <w:t>DEFAULT_RUNTIME_ROOT="${FREQINOUT_RUNTIME_ROOT:-$HOME/.freqinout-multi-rig-test}"</w:t>
-      </w:r>
-    </w:p>
-    <w:p>
-      <w:pPr>
-        <w:pStyle w:val="CommandBlock"/>
-        <w:shd w:fill="F4F6F9"/>
-      </w:pPr>
-    </w:p>
-    <w:p>
-      <w:pPr>
-        <w:pStyle w:val="CommandBlock"/>
-        <w:shd w:fill="F4F6F9"/>
-      </w:pPr>
-      <w:r>
-        <w:t>RUNTIME_ROOT="$DEFAULT_RUNTIME_ROOT"</w:t>
-      </w:r>
-    </w:p>
-    <w:p>
-      <w:pPr>
-        <w:pStyle w:val="CommandBlock"/>
-        <w:shd w:fill="F4F6F9"/>
-      </w:pPr>
-      <w:r>
-        <w:t>CONFIG_ROOT="$RUNTIME_ROOT/config"</w:t>
-      </w:r>
-    </w:p>
-    <w:p>
-      <w:r>
-        <w:t>The rest of the script can continue to create the runtime folders, export FREQINOUT_CONFIG_DIR, change into WORKTREE, and execute freqinout.main.</w:t>
-      </w:r>
-    </w:p>
-    <w:p>
-      <w:r>
-        <w:t>Override either location when needed:</w:t>
-      </w:r>
-    </w:p>
-    <w:p>
-      <w:pPr>
-        <w:pStyle w:val="CommandBlock"/>
-        <w:shd w:fill="F4F6F9"/>
-      </w:pPr>
-      <w:r>
-        <w:t>FREQINOUT_INSTALL_DIR="$HOME/Other-FIO" \</w:t>
-      </w:r>
-    </w:p>
-    <w:p>
-      <w:pPr>
-        <w:pStyle w:val="CommandBlock"/>
-        <w:shd w:fill="F4F6F9"/>
-      </w:pPr>
-      <w:r>
-        <w:t>FREQINOUT_RUNTIME_ROOT="$HOME/.other-fio-runtime" \</w:t>
-      </w:r>
-    </w:p>
-    <w:p>
-      <w:pPr>
-        <w:pStyle w:val="CommandBlock"/>
-        <w:shd w:fill="F4F6F9"/>
-      </w:pPr>
-      <w:r>
-        <w:t>/Users/bill/RadioCode/FreqInOut-multi-rig/start-multi-rig.sh</w:t>
-      </w:r>
-    </w:p>
-    <w:p>
-      <w:pPr>
-        <w:pStyle w:val="Heading1"/>
-      </w:pPr>
-      <w:r>
-        <w:t>Acceptance Checks</w:t>
-      </w:r>
-    </w:p>
-    <w:tbl>
-      <w:tblPr>
-        <w:tblStyle w:val="TableGrid"/>
-        <w:tblW w:type="dxa" w:w="9360"/>
-        <w:jc w:val="left"/>
-        <w:tblLook w:firstColumn="1" w:firstRow="1" w:lastColumn="0" w:lastRow="0" w:noHBand="0" w:noVBand="1" w:val="04A0"/>
-        <w:tblInd w:w="120" w:type="dxa"/>
-      </w:tblPr>
-      <w:tblGrid>
-        <w:gridCol w:w="4680"/>
-        <w:gridCol w:w="4680"/>
-      </w:tblGrid>
-      <w:tr>
-        <w:tc>
-          <w:tcPr>
-            <w:tcW w:type="dxa" w:w="792"/>
-            <w:shd w:fill="E8EEF5"/>
-          </w:tcPr>
-          <w:p>
-            <w:pPr>
-              <w:spacing w:after="0"/>
-            </w:pPr>
-            <w:r>
-              <w:rPr>
-                <w:b/>
-              </w:rPr>
-              <w:t>Done</w:t>
-            </w:r>
-          </w:p>
-        </w:tc>
-        <w:tc>
-          <w:tcPr>
-            <w:tcW w:type="dxa" w:w="8568"/>
-            <w:shd w:fill="E8EEF5"/>
-          </w:tcPr>
-          <w:p>
-            <w:pPr>
-              <w:spacing w:after="0"/>
-            </w:pPr>
-            <w:r>
-              <w:rPr>
-                <w:b/>
-              </w:rPr>
-              <w:t>Acceptance check</w:t>
-            </w:r>
-          </w:p>
-        </w:tc>
-      </w:tr>
-      <w:tr>
-        <w:tc>
-          <w:tcPr>
-            <w:tcW w:type="dxa" w:w="792"/>
-            <w:vAlign w:val="center"/>
-          </w:tcPr>
-          <w:p>
-            <w:pPr>
-              <w:spacing w:after="0"/>
-            </w:pPr>
-            <w:r>
-              <w:t>[ ]</w:t>
-            </w:r>
-          </w:p>
-        </w:tc>
-        <w:tc>
-          <w:tcPr>
-            <w:tcW w:type="dxa" w:w="8568"/>
-            <w:vAlign w:val="center"/>
-          </w:tcPr>
-          <w:p>
-            <w:pPr>
-              <w:spacing w:after="0"/>
-            </w:pPr>
-            <w:r>
-              <w:t>freqinout.db exists only under $HOME/.freqinout-multi-rig-test/config for this run.</w:t>
-            </w:r>
-          </w:p>
-        </w:tc>
-      </w:tr>
-      <w:tr>
-        <w:tc>
-          <w:tcPr>
-            <w:tcW w:type="dxa" w:w="792"/>
-            <w:vAlign w:val="center"/>
-          </w:tcPr>
-          <w:p>
-            <w:pPr>
-              <w:spacing w:after="0"/>
-            </w:pPr>
-            <w:r>
-              <w:t>[ ]</w:t>
-            </w:r>
-          </w:p>
-        </w:tc>
-        <w:tc>
-          <w:tcPr>
-            <w:tcW w:type="dxa" w:w="8568"/>
-            <w:vAlign w:val="center"/>
-          </w:tcPr>
-          <w:p>
-            <w:pPr>
-              <w:spacing w:after="0"/>
-            </w:pPr>
-            <w:r>
-              <w:t>The app starts without using the normal $HOME/.freqinout/config/freqinout.db.</w:t>
-            </w:r>
-          </w:p>
-        </w:tc>
-      </w:tr>
-      <w:tr>
-        <w:tc>
-          <w:tcPr>
-            <w:tcW w:type="dxa" w:w="792"/>
-            <w:vAlign w:val="center"/>
-          </w:tcPr>
-          <w:p>
-            <w:pPr>
-              <w:spacing w:after="0"/>
-            </w:pPr>
-            <w:r>
-              <w:t>[ ]</w:t>
-            </w:r>
-          </w:p>
-        </w:tc>
-        <w:tc>
-          <w:tcPr>
-            <w:tcW w:type="dxa" w:w="8568"/>
-            <w:vAlign w:val="center"/>
-          </w:tcPr>
-          <w:p>
-            <w:pPr>
-              <w:spacing w:after="0"/>
-            </w:pPr>
-            <w:r>
-              <w:t>Settings opens with no existing single-rig data preloaded.</w:t>
-            </w:r>
-          </w:p>
-        </w:tc>
-      </w:tr>
-      <w:tr>
-        <w:tc>
-          <w:tcPr>
-            <w:tcW w:type="dxa" w:w="792"/>
-            <w:vAlign w:val="center"/>
-          </w:tcPr>
-          <w:p>
-            <w:pPr>
-              <w:spacing w:after="0"/>
-            </w:pPr>
-            <w:r>
-              <w:t>[ ]</w:t>
-            </w:r>
-          </w:p>
-        </w:tc>
-        <w:tc>
-          <w:tcPr>
-            <w:tcW w:type="dxa" w:w="8568"/>
-            <w:vAlign w:val="center"/>
-          </w:tcPr>
-          <w:p>
-            <w:pPr>
-              <w:spacing w:after="0"/>
-            </w:pPr>
-            <w:r>
-              <w:t>Multi-rig setup can create the first radio intentionally from the fresh blank slate.</w:t>
-            </w:r>
-          </w:p>
-        </w:tc>
-      </w:tr>
-      <w:tr>
-        <w:tc>
-          <w:tcPr>
-            <w:tcW w:type="dxa" w:w="792"/>
-            <w:vAlign w:val="center"/>
-          </w:tcPr>
-          <w:p>
-            <w:pPr>
-              <w:spacing w:after="0"/>
-            </w:pPr>
-            <w:r>
-              <w:t>[ ]</w:t>
-            </w:r>
-          </w:p>
-        </w:tc>
-        <w:tc>
-          <w:tcPr>
-            <w:tcW w:type="dxa" w:w="8568"/>
-            <w:vAlign w:val="center"/>
-          </w:tcPr>
-          <w:p>
-            <w:pPr>
-              <w:spacing w:after="0"/>
-            </w:pPr>
-            <w:r>
-              <w:t>Station Health does not show no-error waiting states as warnings.</w:t>
-            </w:r>
-          </w:p>
-        </w:tc>
-      </w:tr>
-    </w:tbl>
-    <w:p>
-      <w:pPr>
-        <w:pStyle w:val="Heading1"/>
-      </w:pPr>
-      <w:r>
-        <w:t>Next Step</w:t>
-      </w:r>
-    </w:p>
-    <w:p>
-      <w:r>
-        <w:t>After the isolated fresh install is clean, run an isolated update test in the same install folder. Then run the in-place upgrade test from the current single-rig release.</w:t>
+        <w:rPr>
+          <w:rFonts w:ascii="Aptos" w:hAnsi="Aptos"/>
+        </w:rPr>
+        <w:t>Close FIO and companion applications, then rerun the same installer command. For repair, add --repair; keep --dir, --config-root, and --branch unchanged. After the checks pass, isolated update/restart testing. An in-place single-rig upgrade is a separate, higher-risk scenario and should be performed only when assigned, using the dedicated upgrade guide.</w:t>
       </w:r>
     </w:p>
     <w:sectPr>
-      <w:footerReference w:type="default" r:id="rId9"/>
+      <w:headerReference w:type="default" r:id="rId9"/>
+      <w:footerReference w:type="default" r:id="rId10"/>
       <w:pgSz w:w="12240" w:h="15840"/>
-      <w:pgMar w:top="1440" w:right="1440" w:bottom="1440" w:left="1440" w:header="708" w:footer="708" w:gutter="0"/>
+      <w:pgMar w:top="792" w:right="979" w:bottom="792" w:left="979" w:header="360" w:footer="360" w:gutter="0"/>
       <w:cols w:space="720"/>
       <w:docGrid w:linePitch="360"/>
     </w:sectPr>
@@ -912,10 +566,43 @@
       <w:jc w:val="right"/>
     </w:pPr>
     <w:r>
-      <w:t>FIO Multi-Rig WIP Fresh Install Guide</w:t>
+      <w:rPr>
+        <w:rFonts w:ascii="Aptos" w:hAnsi="Aptos"/>
+        <w:color w:val="50565E"/>
+        <w:sz w:val="16"/>
+      </w:rPr>
+      <w:t xml:space="preserve">FIO Multi-Rig Isolated Fresh Install Guide  •  </w:t>
+    </w:r>
+    <w:r>
+      <w:rPr>
+        <w:rFonts w:ascii="Aptos" w:hAnsi="Aptos"/>
+        <w:sz w:val="16"/>
+      </w:rPr>
+      <w:fldChar w:fldCharType="begin"/>
+      <w:instrText xml:space="preserve"> PAGE </w:instrText>
+      <w:fldChar w:fldCharType="end"/>
     </w:r>
   </w:p>
 </w:ftr>
+</file>
+
+<file path=word/header1.xml><?xml version="1.0" encoding="utf-8"?>
+<w:hdr xmlns:m="http://schemas.openxmlformats.org/officeDocument/2006/math" xmlns:mc="http://schemas.openxmlformats.org/markup-compatibility/2006" xmlns:mo="http://schemas.microsoft.com/office/mac/office/2008/main" xmlns:mv="urn:schemas-microsoft-com:mac:vml" xmlns:o="urn:schemas-microsoft-com:office:office" xmlns:r="http://schemas.openxmlformats.org/officeDocument/2006/relationships" xmlns:v="urn:schemas-microsoft-com:vml" xmlns:w10="urn:schemas-microsoft-com:office:word" xmlns:w14="http://schemas.microsoft.com/office/word/2010/wordml" xmlns:w="http://schemas.openxmlformats.org/wordprocessingml/2006/main" xmlns:wne="http://schemas.microsoft.com/office/word/2006/wordml" xmlns:wp14="http://schemas.microsoft.com/office/word/2010/wordprocessingDrawing" xmlns:wp="http://schemas.openxmlformats.org/drawingml/2006/wordprocessingDrawing" xmlns:wpc="http://schemas.microsoft.com/office/word/2010/wordprocessingCanvas" xmlns:wpg="http://schemas.microsoft.com/office/word/2010/wordprocessingGroup" xmlns:wpi="http://schemas.microsoft.com/office/word/2010/wordprocessingInk" xmlns:wps="http://schemas.microsoft.com/office/word/2010/wordprocessingShape" mc:Ignorable="w14 wp14">
+  <w:p>
+    <w:pPr>
+      <w:pStyle w:val="Header"/>
+      <w:jc w:val="right"/>
+    </w:pPr>
+    <w:r>
+      <w:rPr>
+        <w:rFonts w:ascii="Aptos" w:hAnsi="Aptos"/>
+        <w:color w:val="50565E"/>
+        <w:sz w:val="16"/>
+      </w:rPr>
+      <w:t>FreqInOut 2.0 Testing Preview  •  Linux</w:t>
+    </w:r>
+  </w:p>
+</w:hdr>
 </file>
 
 <file path=word/numbering.xml><?xml version="1.0" encoding="utf-8"?>
@@ -1282,11 +969,12 @@
     <w:qFormat/>
     <w:rsid w:val="00FC693F"/>
     <w:pPr>
-      <w:spacing w:after="120" w:line="300" w:lineRule="auto"/>
+      <w:spacing w:after="80" w:line="250" w:lineRule="auto"/>
     </w:pPr>
     <w:rPr>
-      <w:rFonts w:ascii="Calibri" w:hAnsi="Calibri" w:eastAsia="Calibri"/>
-      <w:sz w:val="22"/>
+      <w:rFonts w:ascii="Aptos" w:hAnsi="Aptos"/>
+      <w:color w:val="191C20"/>
+      <w:sz w:val="18"/>
     </w:rPr>
   </w:style>
   <w:style w:type="paragraph" w:styleId="Header">
@@ -1344,15 +1032,15 @@
     <w:pPr>
       <w:keepNext/>
       <w:keepLines/>
-      <w:spacing w:before="360" w:after="200"/>
+      <w:spacing w:before="200" w:after="80"/>
       <w:outlineLvl w:val="0"/>
     </w:pPr>
     <w:rPr>
-      <w:rFonts w:asciiTheme="majorHAnsi" w:eastAsiaTheme="majorEastAsia" w:hAnsiTheme="majorHAnsi" w:cstheme="majorBidi" w:ascii="Calibri" w:hAnsi="Calibri" w:eastAsia="Calibri"/>
+      <w:rFonts w:asciiTheme="majorHAnsi" w:eastAsiaTheme="majorEastAsia" w:hAnsiTheme="majorHAnsi" w:cstheme="majorBidi" w:ascii="Aptos Display" w:hAnsi="Aptos Display"/>
       <w:b/>
       <w:bCs/>
-      <w:color w:val="2E74B5"/>
-      <w:sz w:val="32"/>
+      <w:color w:val="14181D"/>
+      <w:sz w:val="30"/>
       <w:szCs w:val="28"/>
     </w:rPr>
   </w:style>
@@ -1368,15 +1056,15 @@
     <w:pPr>
       <w:keepNext/>
       <w:keepLines/>
-      <w:spacing w:before="280" w:after="140"/>
+      <w:spacing w:before="140" w:after="60"/>
       <w:outlineLvl w:val="1"/>
     </w:pPr>
     <w:rPr>
-      <w:rFonts w:asciiTheme="majorHAnsi" w:eastAsiaTheme="majorEastAsia" w:hAnsiTheme="majorHAnsi" w:cstheme="majorBidi" w:ascii="Calibri" w:hAnsi="Calibri" w:eastAsia="Calibri"/>
+      <w:rFonts w:asciiTheme="majorHAnsi" w:eastAsiaTheme="majorEastAsia" w:hAnsiTheme="majorHAnsi" w:cstheme="majorBidi" w:ascii="Aptos Display" w:hAnsi="Aptos Display"/>
       <w:b/>
       <w:bCs/>
-      <w:color w:val="2E74B5"/>
-      <w:sz w:val="26"/>
+      <w:color w:val="14181D"/>
+      <w:sz w:val="23"/>
       <w:szCs w:val="26"/>
     </w:rPr>
   </w:style>
@@ -1392,15 +1080,14 @@
     <w:pPr>
       <w:keepNext/>
       <w:keepLines/>
-      <w:spacing w:before="200" w:after="100"/>
+      <w:spacing w:before="200" w:after="0"/>
       <w:outlineLvl w:val="2"/>
     </w:pPr>
     <w:rPr>
-      <w:rFonts w:asciiTheme="majorHAnsi" w:eastAsiaTheme="majorEastAsia" w:hAnsiTheme="majorHAnsi" w:cstheme="majorBidi" w:ascii="Calibri" w:hAnsi="Calibri" w:eastAsia="Calibri"/>
+      <w:rFonts w:asciiTheme="majorHAnsi" w:eastAsiaTheme="majorEastAsia" w:hAnsiTheme="majorHAnsi" w:cstheme="majorBidi"/>
       <w:b/>
       <w:bCs/>
-      <w:color w:val="1F4D78"/>
-      <w:sz w:val="24"/>
+      <w:color w:val="4F81BD" w:themeColor="accent1"/>
     </w:rPr>
   </w:style>
   <w:style w:type="paragraph" w:styleId="Heading4">
@@ -1631,18 +1318,17 @@
     <w:qFormat/>
     <w:rsid w:val="00FC693F"/>
     <w:pPr>
-      <w:pBdr>
-        <w:bottom w:val="single" w:sz="8" w:space="4" w:color="4F81BD" w:themeColor="accent1"/>
-      </w:pBdr>
-      <w:spacing w:after="300" w:line="240" w:lineRule="auto"/>
+      <w:keepNext/>
+      <w:spacing w:after="200" w:line="240" w:lineRule="auto" w:before="0"/>
       <w:contextualSpacing/>
     </w:pPr>
     <w:rPr>
-      <w:rFonts w:asciiTheme="majorHAnsi" w:eastAsiaTheme="majorEastAsia" w:hAnsiTheme="majorHAnsi" w:cstheme="majorBidi"/>
-      <w:color w:val="17365D" w:themeColor="text2" w:themeShade="BF"/>
+      <w:rFonts w:asciiTheme="majorHAnsi" w:eastAsiaTheme="majorEastAsia" w:hAnsiTheme="majorHAnsi" w:cstheme="majorBidi" w:ascii="Aptos Display" w:hAnsi="Aptos Display"/>
+      <w:b/>
+      <w:color w:val="14181D"/>
       <w:spacing w:val="5"/>
       <w:kern w:val="28"/>
-      <w:sz w:val="52"/>
+      <w:sz w:val="44"/>
       <w:szCs w:val="52"/>
     </w:rPr>
   </w:style>
@@ -12971,27 +12657,6 @@
         <w:shd w:val="clear" w:color="auto" w:fill="FBCAA2" w:themeFill="accent6" w:themeFillTint="7F"/>
       </w:tcPr>
     </w:tblStylePr>
-  </w:style>
-  <w:style w:type="paragraph" w:customStyle="1" w:styleId="CommandBlock">
-    <w:name w:val="CommandBlock"/>
-    <w:pPr>
-      <w:spacing w:before="60" w:after="160" w:line="240" w:lineRule="auto"/>
-    </w:pPr>
-    <w:rPr>
-      <w:rFonts w:ascii="Courier New" w:hAnsi="Courier New" w:eastAsia="Courier New"/>
-      <w:sz w:val="18"/>
-    </w:rPr>
-  </w:style>
-  <w:style w:type="paragraph" w:customStyle="1" w:styleId="SmallNote">
-    <w:name w:val="SmallNote"/>
-    <w:pPr>
-      <w:spacing w:after="80" w:line="276" w:lineRule="auto"/>
-    </w:pPr>
-    <w:rPr>
-      <w:rFonts w:ascii="Calibri" w:hAnsi="Calibri" w:eastAsia="Calibri"/>
-      <w:color w:val="555555"/>
-      <w:sz w:val="18"/>
-    </w:rPr>
   </w:style>
 </w:styles>
 </file>

</xml_diff>